<commit_message>
Pruebas de base de datos
</commit_message>
<xml_diff>
--- a/Nombre del proyecto.docx
+++ b/Nombre del proyecto.docx
@@ -25,23 +25,13 @@
       </w:r>
     </w:p>
     <w:p>
-      <w:proofErr w:type="spellStart"/>
-      <w:r>
-        <w:t>Justinmind</w:t>
-      </w:r>
-      <w:proofErr w:type="spellEnd"/>
-      <w:r>
-        <w:t xml:space="preserve"> – diseño de prototipo </w:t>
-      </w:r>
-    </w:p>
-    <w:p>
-      <w:proofErr w:type="spellStart"/>
-      <w:r>
-        <w:t>Firebase</w:t>
-      </w:r>
-      <w:proofErr w:type="spellEnd"/>
-      <w:r>
-        <w:t xml:space="preserve"> – Base de datos</w:t>
+      <w:r>
+        <w:t xml:space="preserve">Justinmind – diseño de prototipo </w:t>
+      </w:r>
+    </w:p>
+    <w:p>
+      <w:r>
+        <w:t>Firebase – Base de datos</w:t>
       </w:r>
     </w:p>
     <w:p/>
@@ -52,39 +42,56 @@
     </w:p>
     <w:p/>
     <w:p>
-      <w:proofErr w:type="spellStart"/>
       <w:r>
         <w:t>React</w:t>
       </w:r>
-      <w:proofErr w:type="spellEnd"/>
-    </w:p>
-    <w:p>
-      <w:proofErr w:type="spellStart"/>
+    </w:p>
+    <w:p>
       <w:r>
         <w:t>Html</w:t>
       </w:r>
-      <w:proofErr w:type="spellEnd"/>
-    </w:p>
-    <w:p>
-      <w:proofErr w:type="spellStart"/>
+    </w:p>
+    <w:p>
       <w:r>
         <w:t>Css</w:t>
       </w:r>
-      <w:proofErr w:type="spellEnd"/>
-    </w:p>
-    <w:p>
-      <w:r>
-        <w:t>javaScript</w:t>
+    </w:p>
+    <w:p>
+      <w:r>
+        <w:t>JavaScript</w:t>
+      </w:r>
+    </w:p>
+    <w:p>
+      <w:r>
+        <w:t>Node.js</w:t>
+      </w:r>
+    </w:p>
+    <w:p>
+      <w:r>
+        <w:t>Vite.js</w:t>
       </w:r>
     </w:p>
     <w:p/>
-    <w:p>
-      <w:r>
+    <w:p/>
+    <w:p/>
+    <w:p/>
+    <w:p/>
+    <w:p/>
+    <w:p/>
+    <w:p/>
+    <w:p/>
+    <w:p/>
+    <w:p>
+      <w:r>
+        <w:lastRenderedPageBreak/>
         <w:t xml:space="preserve">Ejemplo de bocetos </w:t>
       </w:r>
     </w:p>
     <w:p>
       <w:r>
+        <w:rPr>
+          <w:noProof/>
+        </w:rPr>
         <w:drawing>
           <wp:inline distT="0" distB="0" distL="0" distR="0" wp14:anchorId="7281C366" wp14:editId="0E9E79B4">
             <wp:extent cx="5612130" cy="2573655"/>
@@ -124,7 +131,9 @@
     </w:p>
     <w:p>
       <w:r>
-        <w:lastRenderedPageBreak/>
+        <w:rPr>
+          <w:noProof/>
+        </w:rPr>
         <w:drawing>
           <wp:inline distT="0" distB="0" distL="0" distR="0" wp14:anchorId="79DAD42F" wp14:editId="3E9C8F22">
             <wp:extent cx="5612130" cy="2312670"/>
@@ -164,6 +173,9 @@
     </w:p>
     <w:p>
       <w:r>
+        <w:rPr>
+          <w:noProof/>
+        </w:rPr>
         <w:drawing>
           <wp:inline distT="0" distB="0" distL="0" distR="0" wp14:anchorId="4DB9389F" wp14:editId="4E57A3A0">
             <wp:extent cx="5612130" cy="2619375"/>
@@ -203,6 +215,10 @@
     </w:p>
     <w:p>
       <w:r>
+        <w:rPr>
+          <w:noProof/>
+        </w:rPr>
+        <w:lastRenderedPageBreak/>
         <w:drawing>
           <wp:inline distT="0" distB="0" distL="0" distR="0" wp14:anchorId="557B9A60" wp14:editId="33922EAA">
             <wp:extent cx="5612130" cy="2643505"/>
@@ -242,7 +258,9 @@
     </w:p>
     <w:p>
       <w:r>
-        <w:lastRenderedPageBreak/>
+        <w:rPr>
+          <w:noProof/>
+        </w:rPr>
         <w:drawing>
           <wp:inline distT="0" distB="0" distL="0" distR="0" wp14:anchorId="2CB61124" wp14:editId="31F36710">
             <wp:extent cx="5612130" cy="2670175"/>
@@ -282,6 +300,9 @@
     </w:p>
     <w:p>
       <w:r>
+        <w:rPr>
+          <w:noProof/>
+        </w:rPr>
         <w:drawing>
           <wp:inline distT="0" distB="0" distL="0" distR="0" wp14:anchorId="57E12796" wp14:editId="6D294172">
             <wp:extent cx="5612130" cy="2614930"/>
@@ -321,6 +342,10 @@
     </w:p>
     <w:p>
       <w:r>
+        <w:rPr>
+          <w:noProof/>
+        </w:rPr>
+        <w:lastRenderedPageBreak/>
         <w:drawing>
           <wp:inline distT="0" distB="0" distL="0" distR="0" wp14:anchorId="6E13E0A6" wp14:editId="5870022C">
             <wp:extent cx="5612130" cy="2423795"/>
@@ -359,6 +384,584 @@
       </w:r>
     </w:p>
     <w:p/>
+    <w:p>
+      <w:r>
+        <w:t>INTERFAZ DE INICIO</w:t>
+      </w:r>
+    </w:p>
+    <w:p>
+      <w:r>
+        <w:drawing>
+          <wp:inline distT="0" distB="0" distL="0" distR="0" wp14:anchorId="1860A928" wp14:editId="5C89A93F">
+            <wp:extent cx="5612130" cy="3016250"/>
+            <wp:effectExtent l="0" t="0" r="7620" b="0"/>
+            <wp:docPr id="397624826" name="Imagen 1"/>
+            <wp:cNvGraphicFramePr>
+              <a:graphicFrameLocks xmlns:a="http://schemas.openxmlformats.org/drawingml/2006/main" noChangeAspect="1"/>
+            </wp:cNvGraphicFramePr>
+            <a:graphic xmlns:a="http://schemas.openxmlformats.org/drawingml/2006/main">
+              <a:graphicData uri="http://schemas.openxmlformats.org/drawingml/2006/picture">
+                <pic:pic xmlns:pic="http://schemas.openxmlformats.org/drawingml/2006/picture">
+                  <pic:nvPicPr>
+                    <pic:cNvPr id="397624826" name=""/>
+                    <pic:cNvPicPr/>
+                  </pic:nvPicPr>
+                  <pic:blipFill>
+                    <a:blip r:embed="rId13"/>
+                    <a:stretch>
+                      <a:fillRect/>
+                    </a:stretch>
+                  </pic:blipFill>
+                  <pic:spPr>
+                    <a:xfrm>
+                      <a:off x="0" y="0"/>
+                      <a:ext cx="5612130" cy="3016250"/>
+                    </a:xfrm>
+                    <a:prstGeom prst="rect">
+                      <a:avLst/>
+                    </a:prstGeom>
+                  </pic:spPr>
+                </pic:pic>
+              </a:graphicData>
+            </a:graphic>
+          </wp:inline>
+        </w:drawing>
+      </w:r>
+    </w:p>
+    <w:p>
+      <w:r>
+        <w:lastRenderedPageBreak/>
+        <w:drawing>
+          <wp:inline distT="0" distB="0" distL="0" distR="0" wp14:anchorId="2A79B5D4" wp14:editId="5D526B32">
+            <wp:extent cx="5612130" cy="3016250"/>
+            <wp:effectExtent l="0" t="0" r="7620" b="0"/>
+            <wp:docPr id="5997046" name="Imagen 1"/>
+            <wp:cNvGraphicFramePr>
+              <a:graphicFrameLocks xmlns:a="http://schemas.openxmlformats.org/drawingml/2006/main" noChangeAspect="1"/>
+            </wp:cNvGraphicFramePr>
+            <a:graphic xmlns:a="http://schemas.openxmlformats.org/drawingml/2006/main">
+              <a:graphicData uri="http://schemas.openxmlformats.org/drawingml/2006/picture">
+                <pic:pic xmlns:pic="http://schemas.openxmlformats.org/drawingml/2006/picture">
+                  <pic:nvPicPr>
+                    <pic:cNvPr id="5997046" name=""/>
+                    <pic:cNvPicPr/>
+                  </pic:nvPicPr>
+                  <pic:blipFill>
+                    <a:blip r:embed="rId14"/>
+                    <a:stretch>
+                      <a:fillRect/>
+                    </a:stretch>
+                  </pic:blipFill>
+                  <pic:spPr>
+                    <a:xfrm>
+                      <a:off x="0" y="0"/>
+                      <a:ext cx="5612130" cy="3016250"/>
+                    </a:xfrm>
+                    <a:prstGeom prst="rect">
+                      <a:avLst/>
+                    </a:prstGeom>
+                  </pic:spPr>
+                </pic:pic>
+              </a:graphicData>
+            </a:graphic>
+          </wp:inline>
+        </w:drawing>
+      </w:r>
+    </w:p>
+    <w:p>
+      <w:r>
+        <w:drawing>
+          <wp:inline distT="0" distB="0" distL="0" distR="0" wp14:anchorId="48F2DBCE" wp14:editId="440C6A06">
+            <wp:extent cx="5612130" cy="3016250"/>
+            <wp:effectExtent l="0" t="0" r="7620" b="0"/>
+            <wp:docPr id="1798306058" name="Imagen 1"/>
+            <wp:cNvGraphicFramePr>
+              <a:graphicFrameLocks xmlns:a="http://schemas.openxmlformats.org/drawingml/2006/main" noChangeAspect="1"/>
+            </wp:cNvGraphicFramePr>
+            <a:graphic xmlns:a="http://schemas.openxmlformats.org/drawingml/2006/main">
+              <a:graphicData uri="http://schemas.openxmlformats.org/drawingml/2006/picture">
+                <pic:pic xmlns:pic="http://schemas.openxmlformats.org/drawingml/2006/picture">
+                  <pic:nvPicPr>
+                    <pic:cNvPr id="1798306058" name=""/>
+                    <pic:cNvPicPr/>
+                  </pic:nvPicPr>
+                  <pic:blipFill>
+                    <a:blip r:embed="rId15"/>
+                    <a:stretch>
+                      <a:fillRect/>
+                    </a:stretch>
+                  </pic:blipFill>
+                  <pic:spPr>
+                    <a:xfrm>
+                      <a:off x="0" y="0"/>
+                      <a:ext cx="5612130" cy="3016250"/>
+                    </a:xfrm>
+                    <a:prstGeom prst="rect">
+                      <a:avLst/>
+                    </a:prstGeom>
+                  </pic:spPr>
+                </pic:pic>
+              </a:graphicData>
+            </a:graphic>
+          </wp:inline>
+        </w:drawing>
+      </w:r>
+    </w:p>
+    <w:p>
+      <w:r>
+        <w:lastRenderedPageBreak/>
+        <w:drawing>
+          <wp:inline distT="0" distB="0" distL="0" distR="0" wp14:anchorId="78630F67" wp14:editId="25527A7E">
+            <wp:extent cx="5612130" cy="3016250"/>
+            <wp:effectExtent l="0" t="0" r="7620" b="0"/>
+            <wp:docPr id="842164383" name="Imagen 1"/>
+            <wp:cNvGraphicFramePr>
+              <a:graphicFrameLocks xmlns:a="http://schemas.openxmlformats.org/drawingml/2006/main" noChangeAspect="1"/>
+            </wp:cNvGraphicFramePr>
+            <a:graphic xmlns:a="http://schemas.openxmlformats.org/drawingml/2006/main">
+              <a:graphicData uri="http://schemas.openxmlformats.org/drawingml/2006/picture">
+                <pic:pic xmlns:pic="http://schemas.openxmlformats.org/drawingml/2006/picture">
+                  <pic:nvPicPr>
+                    <pic:cNvPr id="842164383" name=""/>
+                    <pic:cNvPicPr/>
+                  </pic:nvPicPr>
+                  <pic:blipFill>
+                    <a:blip r:embed="rId16"/>
+                    <a:stretch>
+                      <a:fillRect/>
+                    </a:stretch>
+                  </pic:blipFill>
+                  <pic:spPr>
+                    <a:xfrm>
+                      <a:off x="0" y="0"/>
+                      <a:ext cx="5612130" cy="3016250"/>
+                    </a:xfrm>
+                    <a:prstGeom prst="rect">
+                      <a:avLst/>
+                    </a:prstGeom>
+                  </pic:spPr>
+                </pic:pic>
+              </a:graphicData>
+            </a:graphic>
+          </wp:inline>
+        </w:drawing>
+      </w:r>
+    </w:p>
+    <w:p/>
+    <w:p>
+      <w:r>
+        <w:drawing>
+          <wp:inline distT="0" distB="0" distL="0" distR="0" wp14:anchorId="42E5CF68" wp14:editId="53A8602B">
+            <wp:extent cx="5612130" cy="3016250"/>
+            <wp:effectExtent l="0" t="0" r="7620" b="0"/>
+            <wp:docPr id="1308392357" name="Imagen 1"/>
+            <wp:cNvGraphicFramePr>
+              <a:graphicFrameLocks xmlns:a="http://schemas.openxmlformats.org/drawingml/2006/main" noChangeAspect="1"/>
+            </wp:cNvGraphicFramePr>
+            <a:graphic xmlns:a="http://schemas.openxmlformats.org/drawingml/2006/main">
+              <a:graphicData uri="http://schemas.openxmlformats.org/drawingml/2006/picture">
+                <pic:pic xmlns:pic="http://schemas.openxmlformats.org/drawingml/2006/picture">
+                  <pic:nvPicPr>
+                    <pic:cNvPr id="1308392357" name=""/>
+                    <pic:cNvPicPr/>
+                  </pic:nvPicPr>
+                  <pic:blipFill>
+                    <a:blip r:embed="rId17"/>
+                    <a:stretch>
+                      <a:fillRect/>
+                    </a:stretch>
+                  </pic:blipFill>
+                  <pic:spPr>
+                    <a:xfrm>
+                      <a:off x="0" y="0"/>
+                      <a:ext cx="5612130" cy="3016250"/>
+                    </a:xfrm>
+                    <a:prstGeom prst="rect">
+                      <a:avLst/>
+                    </a:prstGeom>
+                  </pic:spPr>
+                </pic:pic>
+              </a:graphicData>
+            </a:graphic>
+          </wp:inline>
+        </w:drawing>
+      </w:r>
+    </w:p>
+    <w:p/>
+    <w:p>
+      <w:r>
+        <w:lastRenderedPageBreak/>
+        <w:drawing>
+          <wp:inline distT="0" distB="0" distL="0" distR="0" wp14:anchorId="3FABC8ED" wp14:editId="3EE15D4D">
+            <wp:extent cx="5612130" cy="3016250"/>
+            <wp:effectExtent l="0" t="0" r="7620" b="0"/>
+            <wp:docPr id="1768011076" name="Imagen 1"/>
+            <wp:cNvGraphicFramePr>
+              <a:graphicFrameLocks xmlns:a="http://schemas.openxmlformats.org/drawingml/2006/main" noChangeAspect="1"/>
+            </wp:cNvGraphicFramePr>
+            <a:graphic xmlns:a="http://schemas.openxmlformats.org/drawingml/2006/main">
+              <a:graphicData uri="http://schemas.openxmlformats.org/drawingml/2006/picture">
+                <pic:pic xmlns:pic="http://schemas.openxmlformats.org/drawingml/2006/picture">
+                  <pic:nvPicPr>
+                    <pic:cNvPr id="1768011076" name=""/>
+                    <pic:cNvPicPr/>
+                  </pic:nvPicPr>
+                  <pic:blipFill>
+                    <a:blip r:embed="rId18"/>
+                    <a:stretch>
+                      <a:fillRect/>
+                    </a:stretch>
+                  </pic:blipFill>
+                  <pic:spPr>
+                    <a:xfrm>
+                      <a:off x="0" y="0"/>
+                      <a:ext cx="5612130" cy="3016250"/>
+                    </a:xfrm>
+                    <a:prstGeom prst="rect">
+                      <a:avLst/>
+                    </a:prstGeom>
+                  </pic:spPr>
+                </pic:pic>
+              </a:graphicData>
+            </a:graphic>
+          </wp:inline>
+        </w:drawing>
+      </w:r>
+    </w:p>
+    <w:p>
+      <w:r>
+        <w:drawing>
+          <wp:inline distT="0" distB="0" distL="0" distR="0" wp14:anchorId="48487035" wp14:editId="2C7A48EB">
+            <wp:extent cx="5612130" cy="3016250"/>
+            <wp:effectExtent l="0" t="0" r="7620" b="0"/>
+            <wp:docPr id="1223006672" name="Imagen 1"/>
+            <wp:cNvGraphicFramePr>
+              <a:graphicFrameLocks xmlns:a="http://schemas.openxmlformats.org/drawingml/2006/main" noChangeAspect="1"/>
+            </wp:cNvGraphicFramePr>
+            <a:graphic xmlns:a="http://schemas.openxmlformats.org/drawingml/2006/main">
+              <a:graphicData uri="http://schemas.openxmlformats.org/drawingml/2006/picture">
+                <pic:pic xmlns:pic="http://schemas.openxmlformats.org/drawingml/2006/picture">
+                  <pic:nvPicPr>
+                    <pic:cNvPr id="1223006672" name=""/>
+                    <pic:cNvPicPr/>
+                  </pic:nvPicPr>
+                  <pic:blipFill>
+                    <a:blip r:embed="rId19"/>
+                    <a:stretch>
+                      <a:fillRect/>
+                    </a:stretch>
+                  </pic:blipFill>
+                  <pic:spPr>
+                    <a:xfrm>
+                      <a:off x="0" y="0"/>
+                      <a:ext cx="5612130" cy="3016250"/>
+                    </a:xfrm>
+                    <a:prstGeom prst="rect">
+                      <a:avLst/>
+                    </a:prstGeom>
+                  </pic:spPr>
+                </pic:pic>
+              </a:graphicData>
+            </a:graphic>
+          </wp:inline>
+        </w:drawing>
+      </w:r>
+    </w:p>
+    <w:p>
+      <w:r>
+        <w:lastRenderedPageBreak/>
+        <w:drawing>
+          <wp:inline distT="0" distB="0" distL="0" distR="0" wp14:anchorId="6EADC1BF" wp14:editId="1D139F7A">
+            <wp:extent cx="5612130" cy="3016250"/>
+            <wp:effectExtent l="0" t="0" r="7620" b="0"/>
+            <wp:docPr id="1385740740" name="Imagen 1"/>
+            <wp:cNvGraphicFramePr>
+              <a:graphicFrameLocks xmlns:a="http://schemas.openxmlformats.org/drawingml/2006/main" noChangeAspect="1"/>
+            </wp:cNvGraphicFramePr>
+            <a:graphic xmlns:a="http://schemas.openxmlformats.org/drawingml/2006/main">
+              <a:graphicData uri="http://schemas.openxmlformats.org/drawingml/2006/picture">
+                <pic:pic xmlns:pic="http://schemas.openxmlformats.org/drawingml/2006/picture">
+                  <pic:nvPicPr>
+                    <pic:cNvPr id="1385740740" name=""/>
+                    <pic:cNvPicPr/>
+                  </pic:nvPicPr>
+                  <pic:blipFill>
+                    <a:blip r:embed="rId20"/>
+                    <a:stretch>
+                      <a:fillRect/>
+                    </a:stretch>
+                  </pic:blipFill>
+                  <pic:spPr>
+                    <a:xfrm>
+                      <a:off x="0" y="0"/>
+                      <a:ext cx="5612130" cy="3016250"/>
+                    </a:xfrm>
+                    <a:prstGeom prst="rect">
+                      <a:avLst/>
+                    </a:prstGeom>
+                  </pic:spPr>
+                </pic:pic>
+              </a:graphicData>
+            </a:graphic>
+          </wp:inline>
+        </w:drawing>
+      </w:r>
+    </w:p>
+    <w:p/>
+    <w:p/>
+    <w:p>
+      <w:r>
+        <w:drawing>
+          <wp:inline distT="0" distB="0" distL="0" distR="0" wp14:anchorId="293D65C5" wp14:editId="122CA749">
+            <wp:extent cx="5612130" cy="3016250"/>
+            <wp:effectExtent l="0" t="0" r="7620" b="0"/>
+            <wp:docPr id="274942119" name="Imagen 1"/>
+            <wp:cNvGraphicFramePr>
+              <a:graphicFrameLocks xmlns:a="http://schemas.openxmlformats.org/drawingml/2006/main" noChangeAspect="1"/>
+            </wp:cNvGraphicFramePr>
+            <a:graphic xmlns:a="http://schemas.openxmlformats.org/drawingml/2006/main">
+              <a:graphicData uri="http://schemas.openxmlformats.org/drawingml/2006/picture">
+                <pic:pic xmlns:pic="http://schemas.openxmlformats.org/drawingml/2006/picture">
+                  <pic:nvPicPr>
+                    <pic:cNvPr id="274942119" name=""/>
+                    <pic:cNvPicPr/>
+                  </pic:nvPicPr>
+                  <pic:blipFill>
+                    <a:blip r:embed="rId21"/>
+                    <a:stretch>
+                      <a:fillRect/>
+                    </a:stretch>
+                  </pic:blipFill>
+                  <pic:spPr>
+                    <a:xfrm>
+                      <a:off x="0" y="0"/>
+                      <a:ext cx="5612130" cy="3016250"/>
+                    </a:xfrm>
+                    <a:prstGeom prst="rect">
+                      <a:avLst/>
+                    </a:prstGeom>
+                  </pic:spPr>
+                </pic:pic>
+              </a:graphicData>
+            </a:graphic>
+          </wp:inline>
+        </w:drawing>
+      </w:r>
+    </w:p>
+    <w:p/>
+    <w:p>
+      <w:r>
+        <w:lastRenderedPageBreak/>
+        <w:drawing>
+          <wp:inline distT="0" distB="0" distL="0" distR="0" wp14:anchorId="2014BFAE" wp14:editId="4B4480A0">
+            <wp:extent cx="5612130" cy="3016250"/>
+            <wp:effectExtent l="0" t="0" r="7620" b="0"/>
+            <wp:docPr id="1547715289" name="Imagen 1"/>
+            <wp:cNvGraphicFramePr>
+              <a:graphicFrameLocks xmlns:a="http://schemas.openxmlformats.org/drawingml/2006/main" noChangeAspect="1"/>
+            </wp:cNvGraphicFramePr>
+            <a:graphic xmlns:a="http://schemas.openxmlformats.org/drawingml/2006/main">
+              <a:graphicData uri="http://schemas.openxmlformats.org/drawingml/2006/picture">
+                <pic:pic xmlns:pic="http://schemas.openxmlformats.org/drawingml/2006/picture">
+                  <pic:nvPicPr>
+                    <pic:cNvPr id="1547715289" name=""/>
+                    <pic:cNvPicPr/>
+                  </pic:nvPicPr>
+                  <pic:blipFill>
+                    <a:blip r:embed="rId22"/>
+                    <a:stretch>
+                      <a:fillRect/>
+                    </a:stretch>
+                  </pic:blipFill>
+                  <pic:spPr>
+                    <a:xfrm>
+                      <a:off x="0" y="0"/>
+                      <a:ext cx="5612130" cy="3016250"/>
+                    </a:xfrm>
+                    <a:prstGeom prst="rect">
+                      <a:avLst/>
+                    </a:prstGeom>
+                  </pic:spPr>
+                </pic:pic>
+              </a:graphicData>
+            </a:graphic>
+          </wp:inline>
+        </w:drawing>
+      </w:r>
+    </w:p>
+    <w:p/>
+    <w:p>
+      <w:r>
+        <w:drawing>
+          <wp:inline distT="0" distB="0" distL="0" distR="0" wp14:anchorId="6C48D871" wp14:editId="49C95E02">
+            <wp:extent cx="5612130" cy="3016250"/>
+            <wp:effectExtent l="0" t="0" r="7620" b="0"/>
+            <wp:docPr id="1711296248" name="Imagen 1"/>
+            <wp:cNvGraphicFramePr>
+              <a:graphicFrameLocks xmlns:a="http://schemas.openxmlformats.org/drawingml/2006/main" noChangeAspect="1"/>
+            </wp:cNvGraphicFramePr>
+            <a:graphic xmlns:a="http://schemas.openxmlformats.org/drawingml/2006/main">
+              <a:graphicData uri="http://schemas.openxmlformats.org/drawingml/2006/picture">
+                <pic:pic xmlns:pic="http://schemas.openxmlformats.org/drawingml/2006/picture">
+                  <pic:nvPicPr>
+                    <pic:cNvPr id="1711296248" name=""/>
+                    <pic:cNvPicPr/>
+                  </pic:nvPicPr>
+                  <pic:blipFill>
+                    <a:blip r:embed="rId23"/>
+                    <a:stretch>
+                      <a:fillRect/>
+                    </a:stretch>
+                  </pic:blipFill>
+                  <pic:spPr>
+                    <a:xfrm>
+                      <a:off x="0" y="0"/>
+                      <a:ext cx="5612130" cy="3016250"/>
+                    </a:xfrm>
+                    <a:prstGeom prst="rect">
+                      <a:avLst/>
+                    </a:prstGeom>
+                  </pic:spPr>
+                </pic:pic>
+              </a:graphicData>
+            </a:graphic>
+          </wp:inline>
+        </w:drawing>
+      </w:r>
+    </w:p>
+    <w:p/>
+    <w:p>
+      <w:r>
+        <w:lastRenderedPageBreak/>
+        <w:drawing>
+          <wp:inline distT="0" distB="0" distL="0" distR="0" wp14:anchorId="13C574D6" wp14:editId="5B5846A8">
+            <wp:extent cx="5612130" cy="3016250"/>
+            <wp:effectExtent l="0" t="0" r="7620" b="0"/>
+            <wp:docPr id="148655970" name="Imagen 1"/>
+            <wp:cNvGraphicFramePr>
+              <a:graphicFrameLocks xmlns:a="http://schemas.openxmlformats.org/drawingml/2006/main" noChangeAspect="1"/>
+            </wp:cNvGraphicFramePr>
+            <a:graphic xmlns:a="http://schemas.openxmlformats.org/drawingml/2006/main">
+              <a:graphicData uri="http://schemas.openxmlformats.org/drawingml/2006/picture">
+                <pic:pic xmlns:pic="http://schemas.openxmlformats.org/drawingml/2006/picture">
+                  <pic:nvPicPr>
+                    <pic:cNvPr id="148655970" name=""/>
+                    <pic:cNvPicPr/>
+                  </pic:nvPicPr>
+                  <pic:blipFill>
+                    <a:blip r:embed="rId24"/>
+                    <a:stretch>
+                      <a:fillRect/>
+                    </a:stretch>
+                  </pic:blipFill>
+                  <pic:spPr>
+                    <a:xfrm>
+                      <a:off x="0" y="0"/>
+                      <a:ext cx="5612130" cy="3016250"/>
+                    </a:xfrm>
+                    <a:prstGeom prst="rect">
+                      <a:avLst/>
+                    </a:prstGeom>
+                  </pic:spPr>
+                </pic:pic>
+              </a:graphicData>
+            </a:graphic>
+          </wp:inline>
+        </w:drawing>
+      </w:r>
+    </w:p>
+    <w:p>
+      <w:r>
+        <w:rPr>
+          <w:noProof/>
+        </w:rPr>
+        <w:drawing>
+          <wp:inline distT="0" distB="0" distL="0" distR="0" wp14:anchorId="00057B13" wp14:editId="48BFC7E8">
+            <wp:extent cx="5544334" cy="2980051"/>
+            <wp:effectExtent l="0" t="0" r="0" b="0"/>
+            <wp:docPr id="1901736866" name="Imagen 1"/>
+            <wp:cNvGraphicFramePr>
+              <a:graphicFrameLocks xmlns:a="http://schemas.openxmlformats.org/drawingml/2006/main" noChangeAspect="1"/>
+            </wp:cNvGraphicFramePr>
+            <a:graphic xmlns:a="http://schemas.openxmlformats.org/drawingml/2006/main">
+              <a:graphicData uri="http://schemas.openxmlformats.org/drawingml/2006/picture">
+                <pic:pic xmlns:pic="http://schemas.openxmlformats.org/drawingml/2006/picture">
+                  <pic:nvPicPr>
+                    <pic:cNvPr id="0" name="Picture 2"/>
+                    <pic:cNvPicPr>
+                      <a:picLocks noChangeAspect="1" noChangeArrowheads="1"/>
+                    </pic:cNvPicPr>
+                  </pic:nvPicPr>
+                  <pic:blipFill>
+                    <a:blip r:embed="rId25" cstate="print">
+                      <a:extLst>
+                        <a:ext uri="{28A0092B-C50C-407E-A947-70E740481C1C}">
+                          <a14:useLocalDpi xmlns:a14="http://schemas.microsoft.com/office/drawing/2010/main" val="0"/>
+                        </a:ext>
+                      </a:extLst>
+                    </a:blip>
+                    <a:srcRect/>
+                    <a:stretch>
+                      <a:fillRect/>
+                    </a:stretch>
+                  </pic:blipFill>
+                  <pic:spPr bwMode="auto">
+                    <a:xfrm>
+                      <a:off x="0" y="0"/>
+                      <a:ext cx="5563700" cy="2990460"/>
+                    </a:xfrm>
+                    <a:prstGeom prst="rect">
+                      <a:avLst/>
+                    </a:prstGeom>
+                    <a:noFill/>
+                  </pic:spPr>
+                </pic:pic>
+              </a:graphicData>
+            </a:graphic>
+          </wp:inline>
+        </w:drawing>
+      </w:r>
+    </w:p>
+    <w:p>
+      <w:r>
+        <w:lastRenderedPageBreak/>
+        <w:drawing>
+          <wp:inline distT="0" distB="0" distL="0" distR="0" wp14:anchorId="3B2A4F0B" wp14:editId="1AF90556">
+            <wp:extent cx="5612130" cy="3016250"/>
+            <wp:effectExtent l="0" t="0" r="7620" b="0"/>
+            <wp:docPr id="830853967" name="Imagen 1"/>
+            <wp:cNvGraphicFramePr>
+              <a:graphicFrameLocks xmlns:a="http://schemas.openxmlformats.org/drawingml/2006/main" noChangeAspect="1"/>
+            </wp:cNvGraphicFramePr>
+            <a:graphic xmlns:a="http://schemas.openxmlformats.org/drawingml/2006/main">
+              <a:graphicData uri="http://schemas.openxmlformats.org/drawingml/2006/picture">
+                <pic:pic xmlns:pic="http://schemas.openxmlformats.org/drawingml/2006/picture">
+                  <pic:nvPicPr>
+                    <pic:cNvPr id="830853967" name=""/>
+                    <pic:cNvPicPr/>
+                  </pic:nvPicPr>
+                  <pic:blipFill>
+                    <a:blip r:embed="rId26"/>
+                    <a:stretch>
+                      <a:fillRect/>
+                    </a:stretch>
+                  </pic:blipFill>
+                  <pic:spPr>
+                    <a:xfrm>
+                      <a:off x="0" y="0"/>
+                      <a:ext cx="5612130" cy="3016250"/>
+                    </a:xfrm>
+                    <a:prstGeom prst="rect">
+                      <a:avLst/>
+                    </a:prstGeom>
+                  </pic:spPr>
+                </pic:pic>
+              </a:graphicData>
+            </a:graphic>
+          </wp:inline>
+        </w:drawing>
+      </w:r>
+    </w:p>
     <w:sectPr>
       <w:pgSz w:w="12240" w:h="15840"/>
       <w:pgMar w:top="1417" w:right="1701" w:bottom="1417" w:left="1701" w:header="708" w:footer="708" w:gutter="0"/>

</xml_diff>